<commit_message>
Prayer guide 2026-10-04: 10 points
Co-Authored-By: Claude Sonnet 5.5 <noreply@anthropic.com>
Claude-Session: https://claude.ai/code/session_01QZwzVwANhwuhuNYw1Px2Fn
</commit_message>
<xml_diff>
--- a/prayer/2026-10-04.docx
+++ b/prayer/2026-10-04.docx
@@ -414,6 +414,17 @@
           <w:t xml:space="preserve">Israel heads to 27 October Knesset election; Otzma Yehudit names ministry demands</w:t>
         </w:r>
       </w:hyperlink>
+      <w:r>
+        <w:t xml:space="preserve">; </w:t>
+      </w:r>
+      <w:hyperlink r:id="rIdL4" w:history="1">
+        <w:r>
+          <w:rPr>
+            <w:rStyle w:val="Hyperlink"/>
+          </w:rPr>
+          <w:t xml:space="preserve">Flydubai copilot said to have intended to crash plane in Israel</w:t>
+        </w:r>
+      </w:hyperlink>
     </w:p>
     <w:p>
       <w:pPr>
@@ -465,7 +476,7 @@
         <w:t xml:space="preserve">Prayer: </w:t>
       </w:r>
       <w:r>
-        <w:t xml:space="preserve">Lord Jesus, as Israel moves toward the election on 27 October, I obey the word to make supplications, prayers and intercessions for all in authority. Give wisdom, integrity and humility to every candidate and to every voter. Protect the campaign from violence and from fear, as the prime minister has warned of possible attack. Let the nation's leaders seek what is right rather than only what is popular, so that Israel may lead a quiet and peaceable life in godliness and honesty. Raise up leaders who fear You, and let Your peace guard the ballot boxes and the people who vote. Amen.</w:t>
+        <w:t xml:space="preserve">Lord Jesus, as Israel moves toward the election on 27 October, I obey the word to make supplications, prayers and intercessions for all in authority. Give wisdom, integrity and humility to every candidate and to every voter. Protect the campaign from violence and from fear, as the prime minister has warned of possible attack, and guard the skies and the airports, for an Omani copilot reportedly meant to crash a plane in Israel. Let the nation's leaders seek what is right rather than only what is popular, so that Israel may lead a quiet and peaceable life in godliness and honesty. Raise up leaders who fear You, and let Your peace guard the ballot boxes and the people who vote. Amen.</w:t>
       </w:r>
     </w:p>
     <w:p>
@@ -487,7 +498,7 @@
         </w:rPr>
         <w:t xml:space="preserve">In the news: </w:t>
       </w:r>
-      <w:hyperlink r:id="rIdL4" w:history="1">
+      <w:hyperlink r:id="rIdL5" w:history="1">
         <w:r>
           <w:rPr>
             <w:rStyle w:val="Hyperlink"/>
@@ -498,7 +509,7 @@
       <w:r>
         <w:t xml:space="preserve">; </w:t>
       </w:r>
-      <w:hyperlink r:id="rIdL5" w:history="1">
+      <w:hyperlink r:id="rIdL6" w:history="1">
         <w:r>
           <w:rPr>
             <w:rStyle w:val="Hyperlink"/>
@@ -579,7 +590,7 @@
         </w:rPr>
         <w:t xml:space="preserve">In the news: </w:t>
       </w:r>
-      <w:hyperlink r:id="rIdL6" w:history="1">
+      <w:hyperlink r:id="rIdL7" w:history="1">
         <w:r>
           <w:rPr>
             <w:rStyle w:val="Hyperlink"/>
@@ -660,7 +671,7 @@
         </w:rPr>
         <w:t xml:space="preserve">In the news: </w:t>
       </w:r>
-      <w:hyperlink r:id="rIdL7" w:history="1">
+      <w:hyperlink r:id="rIdL8" w:history="1">
         <w:r>
           <w:rPr>
             <w:rStyle w:val="Hyperlink"/>

</xml_diff>